<commit_message>
Remove government project descriptions
</commit_message>
<xml_diff>
--- a/public/site/media/Chen-Xing-UI-Designer-Resume-2026.docx
+++ b/public/site/media/Chen-Xing-UI-Designer-Resume-2026.docx
@@ -527,24 +527,6 @@
     </w:p>
     <w:p>
       <w:pPr>
-        <w:pStyle w:val="ListBullet"/>
-        <w:keepLines/>
-        <w:spacing w:before="0" w:after="22" w:line="257" w:lineRule="auto"/>
-        <w:ind w:left="255" w:hanging="113"/>
-      </w:pPr>
-      <w:r>
-        <w:rPr>
-          <w:rFonts w:ascii="Arial" w:hAnsi="Arial" w:eastAsia="Microsoft YaHei"/>
-          <w:b w:val="0"/>
-          <w:i w:val="0"/>
-          <w:color w:val="0F1D2B"/>
-          <w:sz w:val="17"/>
-        </w:rPr>
-        <w:t>参与南岳旅游区新型 APP 设计，推动后续小程序合作，并为工作室业务拓展与项目营收增长提供设计支持。</w:t>
-      </w:r>
-    </w:p>
-    <w:p>
-      <w:pPr>
         <w:keepNext/>
         <w:keepLines/>
         <w:spacing w:before="90" w:after="44" w:line="240" w:lineRule="auto"/>

</xml_diff>